<commit_message>
docs: documento tecnico actualizado con la fuente web
</commit_message>
<xml_diff>
--- a/docs/Documento_Tecnico_ETL_Airflow.docx
+++ b/docs/Documento_Tecnico_ETL_Airflow.docx
@@ -371,7 +371,7 @@
     </w:p>
     <w:p>
       <w:r>
-        <w:t>Este documento describe un pipeline ETL automatizado con Apache Airflow que integra tres fuentes de datos (un archivo CSV con lecturas históricas de clima y calidad del aire, una base de datos con indicadores de emisiones por país y la API pública Open-Meteo), valida su calidad con Great Expectations y solo carga al Data Warehouse los datos que superan las validaciones. El almacén es una base PostgreSQL con modelo estrella y un dashboard en Streamlit consulta únicamente los datos ya validados. El proyecto está alineado con el Objetivo de Desarrollo Sostenible (ODS) 13, Acción por el clima, y con la meta 11.6 del ODS 11 sobre la calidad del aire urbano. Se presentan los objetivos refinados, el análisis exploratorio, el diseño del DAG, las reglas de calidad, el modelo de datos y las visualizaciones con sus conclusiones.</w:t>
+        <w:t>Este documento describe un pipeline ETL automatizado con Apache Airflow que integra cuatro fuentes de datos (un archivo CSV con lecturas históricas de clima y calidad del aire, una base de datos con indicadores de emisiones por país, la API pública Open-Meteo y una tabla web extraída mediante scraping), valida su calidad con Great Expectations y solo carga al Data Warehouse los datos que superan las validaciones. El almacén es una base PostgreSQL con modelo estrella y un dashboard en Streamlit consulta únicamente los datos ya validados. El proyecto está alineado con el Objetivo de Desarrollo Sostenible (ODS) 13, Acción por el clima, y con la meta 11.6 del ODS 11 sobre la calidad del aire urbano. Se presentan los objetivos refinados, el análisis exploratorio, el diseño del DAG, las reglas de calidad, el modelo de datos y las visualizaciones con sus conclusiones.</w:t>
       </w:r>
     </w:p>
     <w:p>
@@ -382,7 +382,7 @@
         <w:t xml:space="preserve">Palabras clave: </w:t>
       </w:r>
       <w:r>
-        <w:t>ETL, Apache Airflow, Great Expectations, calidad de datos, modelo estrella, calidad del aire, ODS 13.</w:t>
+        <w:t>ETL, Apache Airflow, Great Expectations, calidad de datos, web scraping, modelo estrella, calidad del aire, ODS 13.</w:t>
       </w:r>
     </w:p>
     <w:p>
@@ -435,6 +435,14 @@
         <w:pStyle w:val="ListBullet"/>
       </w:pPr>
       <w:r>
+        <w:t>Contrastar la medición de cada ciudad con el promedio anual de PM2.5 de su país y con los años de vida perdidos por la contaminación, publicados en una tabla web.</w:t>
+      </w:r>
+    </w:p>
+    <w:p>
+      <w:pPr>
+        <w:pStyle w:val="ListBullet"/>
+      </w:pPr>
+      <w:r>
         <w:t>Garantizar que solo se cargan datos válidos: cada ejecución se valida y, si falla una regla crítica, la carga se bloquea y queda registrada.</w:t>
       </w:r>
     </w:p>
@@ -463,7 +471,7 @@
         <w:ind w:firstLine="720"/>
       </w:pPr>
       <w:r>
-        <w:t>El pipeline extrae datos de tres fuentes con formatos distintos, tal como muestra la Tabla 1. La primera es el conjunto de datos World Weather Repository publicado en Kaggle (Elgiriyewithana, 2023), reutilizado del proyecto anterior. La segunda es el conjunto de emisiones de CO₂ y economía de Our World in Data (Ritchie et al., 2023), almacenado en una base de datos PostgreSQL de la que Airflow lo extrae con SQL. La tercera es la API pública Open-Meteo (Zippenfenig, 2023).</w:t>
+        <w:t>El pipeline extrae datos de cuatro fuentes con formatos distintos, tal como muestra la Tabla 1. La primera es el conjunto de datos World Weather Repository publicado en Kaggle (Elgiriyewithana, 2023), reutilizado del proyecto anterior. La segunda es el conjunto de emisiones de CO₂ y economía de Our World in Data (Ritchie et al., 2023), almacenado en una base de datos PostgreSQL de la que Airflow lo extrae con SQL. La tercera es la API pública Open-Meteo (Zippenfenig, 2023). La cuarta es una tabla pública de Wikipedia con el PM2.5 anual y los años de vida perdidos por la contaminación en cada país, que el pipeline obtiene mediante web scraping (Wikipedia, 2026).</w:t>
       </w:r>
     </w:p>
     <w:p>
@@ -852,6 +860,92 @@
           </w:p>
         </w:tc>
       </w:tr>
+      <w:tr>
+        <w:tc>
+          <w:tcPr>
+            <w:tcW w:type="dxa" w:w="432"/>
+          </w:tcPr>
+          <w:p>
+            <w:pPr>
+              <w:spacing w:line="240" w:lineRule="auto" w:after="0"/>
+            </w:pPr>
+            <w:r>
+              <w:rPr>
+                <w:sz w:val="18"/>
+              </w:rPr>
+            </w:r>
+            <w:r>
+              <w:rPr>
+                <w:sz w:val="18"/>
+              </w:rPr>
+              <w:t>4</w:t>
+            </w:r>
+          </w:p>
+        </w:tc>
+        <w:tc>
+          <w:tcPr>
+            <w:tcW w:type="dxa" w:w="2448"/>
+          </w:tcPr>
+          <w:p>
+            <w:pPr>
+              <w:spacing w:line="240" w:lineRule="auto" w:after="0"/>
+            </w:pPr>
+            <w:r>
+              <w:rPr>
+                <w:sz w:val="18"/>
+              </w:rPr>
+            </w:r>
+            <w:r>
+              <w:rPr>
+                <w:sz w:val="18"/>
+              </w:rPr>
+              <w:t>Wikipedia, contaminación del aire por país</w:t>
+            </w:r>
+          </w:p>
+        </w:tc>
+        <w:tc>
+          <w:tcPr>
+            <w:tcW w:type="dxa" w:w="2304"/>
+          </w:tcPr>
+          <w:p>
+            <w:pPr>
+              <w:spacing w:line="240" w:lineRule="auto" w:after="0"/>
+            </w:pPr>
+            <w:r>
+              <w:rPr>
+                <w:sz w:val="18"/>
+              </w:rPr>
+            </w:r>
+            <w:r>
+              <w:rPr>
+                <w:sz w:val="18"/>
+              </w:rPr>
+              <w:t>web scraping (requests y BeautifulSoup)</w:t>
+            </w:r>
+          </w:p>
+        </w:tc>
+        <w:tc>
+          <w:tcPr>
+            <w:tcW w:type="dxa" w:w="4176"/>
+          </w:tcPr>
+          <w:p>
+            <w:pPr>
+              <w:spacing w:line="240" w:lineRule="auto" w:after="0"/>
+            </w:pPr>
+            <w:r>
+              <w:rPr>
+                <w:sz w:val="18"/>
+              </w:rPr>
+            </w:r>
+            <w:r>
+              <w:rPr>
+                <w:sz w:val="18"/>
+              </w:rPr>
+              <w:t>217 países con PM2.5 anual (µg/m³) y años de esperanza de vida perdidos</w:t>
+            </w:r>
+          </w:p>
+        </w:tc>
+      </w:tr>
     </w:tbl>
     <w:p/>
     <w:p>
@@ -884,6 +978,33 @@
     <w:p>
       <w:pPr>
         <w:keepNext/>
+      </w:pPr>
+      <w:r>
+        <w:rPr>
+          <w:b/>
+        </w:rPr>
+        <w:t>2.2 Extracción desde la web</w:t>
+      </w:r>
+    </w:p>
+    <w:p>
+      <w:pPr>
+        <w:ind w:firstLine="720"/>
+      </w:pPr>
+      <w:r>
+        <w:t>La cuarta fuente es la tabla de países de la página List of countries by air pollution de Wikipedia. Se eligió porque aporta un dato que ninguna otra fuente tiene, el PM2.5 anual de cada país y su efecto sobre la esperanza de vida, y porque es una página estable, con estructura de tabla y licencia abierta (CC BY-SA). La extracción descarga el HTML con la librería requests, identificándose con un User-Agent y con un tiempo máximo de espera, y localiza la tabla con BeautifulSoup a partir de su encabezado; si la estructura cambia, la tarea falla en lugar de cargar datos incorrectos.</w:t>
+      </w:r>
+    </w:p>
+    <w:p>
+      <w:pPr>
+        <w:ind w:firstLine="720"/>
+      </w:pPr>
+      <w:r>
+        <w:t>La transformación convierte el texto en números (la página publica los años de vida perdidos con signo menos tipográfico, que se guarda como magnitud positiva), elimina notas al pie si existen y asigna el código ISO3 de cada país. De los 217 nombres, 178 coinciden directamente con la tabla de países del CSV, 38 se resuelven por nombre estándar o alias y un territorio sin código se descarta, por lo que quedan 216 países sin valores nulos. El PM2.5 anual promedio es 13.1 µg/m³, con mediana de 11.5 y máximo de 54.2 en Bangladesh. Este valor es un promedio anual por país y no una lectura diaria, por lo que se guarda como atributo de la dimensión de país y se calcula la diferencia entre la lectura de cada ciudad y ese promedio.</w:t>
+      </w:r>
+    </w:p>
+    <w:p>
+      <w:pPr>
+        <w:keepNext/>
         <w:jc w:val="center"/>
       </w:pPr>
       <w:r>
@@ -898,7 +1019,7 @@
         <w:ind w:firstLine="720"/>
       </w:pPr>
       <w:r>
-        <w:t>La Figura 1 presenta la arquitectura actualizada. Las tres fuentes alimentan tres ramas paralelas dentro de un DAG de Airflow; las ramas se unen en un dataset enriquecido que pasa por la validación de Great Expectations y, solo si aprueba, se carga en el Data Warehouse. Los resultados de la validación y el estado de cada ejecución se guardan en tablas de auditoría. Todo se ejecuta con Docker Compose.</w:t>
+        <w:t>La Figura 1 presenta la arquitectura actualizada. Las cuatro fuentes alimentan cuatro ramas paralelas dentro de un DAG de Airflow; las ramas se unen en un dataset enriquecido que pasa por la validación de Great Expectations y, solo si aprueba, se carga en el Data Warehouse. Los resultados de la validación y el estado de cada ejecución se guardan en tablas de auditoría. Todo se ejecuta con Docker Compose.</w:t>
       </w:r>
     </w:p>
     <w:p>
@@ -909,7 +1030,7 @@
       <w:r>
         <w:drawing>
           <wp:inline xmlns:a="http://schemas.openxmlformats.org/drawingml/2006/main" xmlns:pic="http://schemas.openxmlformats.org/drawingml/2006/picture">
-            <wp:extent cx="5760720" cy="1499365"/>
+            <wp:extent cx="5760720" cy="1829071"/>
             <wp:docPr id="1" name="Picture 1"/>
             <wp:cNvGraphicFramePr>
               <a:graphicFrameLocks noChangeAspect="1"/>
@@ -930,7 +1051,7 @@
                   <pic:spPr>
                     <a:xfrm>
                       <a:off x="0" y="0"/>
-                      <a:ext cx="5760720" cy="1499365"/>
+                      <a:ext cx="5760720" cy="1829071"/>
                     </a:xfrm>
                     <a:prstGeom prst="rect"/>
                   </pic:spPr>
@@ -1161,7 +1282,7 @@
               <w:rPr>
                 <w:sz w:val="20"/>
               </w:rPr>
-              <w:t>CSV, PostgreSQL y API Open-Meteo</w:t>
+              <w:t>CSV, PostgreSQL, API Open-Meteo y página web</w:t>
             </w:r>
           </w:p>
         </w:tc>
@@ -1182,7 +1303,7 @@
               <w:rPr>
                 <w:sz w:val="20"/>
               </w:rPr>
-              <w:t>datos históricos, indicadores por país y datos frescos</w:t>
+              <w:t>datos históricos, indicadores por país, datos frescos y referencia nacional de PM2.5</w:t>
             </w:r>
           </w:p>
         </w:tc>
@@ -1531,7 +1652,7 @@
         <w:ind w:firstLine="720"/>
       </w:pPr>
       <w:r>
-        <w:t>El análisis exploratorio se realizó sobre las tres fuentes en un cuaderno de Jupyter, revisando estructura, tipos de dato, valores nulos, duplicados y valores atípicos. Los hallazgos determinaron las transformaciones que resume la Tabla 3.</w:t>
+        <w:t>El análisis exploratorio se realizó sobre las cuatro fuentes en un cuaderno de Jupyter, revisando estructura, tipos de dato, valores nulos, duplicados y valores atípicos. Los hallazgos determinaron las transformaciones que resume la Tabla 3.</w:t>
       </w:r>
     </w:p>
     <w:p>
@@ -2050,6 +2171,50 @@
                 <w:sz w:val="18"/>
               </w:rPr>
               <w:t>derivar la categoría EPA (1 a 6) del AQI</w:t>
+            </w:r>
+          </w:p>
+        </w:tc>
+      </w:tr>
+      <w:tr>
+        <w:tc>
+          <w:tcPr>
+            <w:tcW w:type="dxa" w:w="4896"/>
+          </w:tcPr>
+          <w:p>
+            <w:pPr>
+              <w:spacing w:line="240" w:lineRule="auto" w:after="0"/>
+            </w:pPr>
+            <w:r>
+              <w:rPr>
+                <w:sz w:val="18"/>
+              </w:rPr>
+            </w:r>
+            <w:r>
+              <w:rPr>
+                <w:sz w:val="18"/>
+              </w:rPr>
+              <w:t>La tabla web usa el signo menos tipográfico y 39 de sus 217 nombres no están en el mapa de países</w:t>
+            </w:r>
+          </w:p>
+        </w:tc>
+        <w:tc>
+          <w:tcPr>
+            <w:tcW w:type="dxa" w:w="4464"/>
+          </w:tcPr>
+          <w:p>
+            <w:pPr>
+              <w:spacing w:line="240" w:lineRule="auto" w:after="0"/>
+            </w:pPr>
+            <w:r>
+              <w:rPr>
+                <w:sz w:val="18"/>
+              </w:rPr>
+            </w:r>
+            <w:r>
+              <w:rPr>
+                <w:sz w:val="18"/>
+              </w:rPr>
+              <w:t>convertir a número, asignar ISO3 por nombre, nombre estándar o alias y descartar territorios sin código</w:t>
             </w:r>
           </w:p>
         </w:tc>
@@ -2562,7 +2727,7 @@
               <w:rPr>
                 <w:sz w:val="18"/>
               </w:rPr>
-              <w:t>Transform CSV</w:t>
+              <w:t>Extract Web</w:t>
             </w:r>
           </w:p>
         </w:tc>
@@ -2583,7 +2748,7 @@
               <w:rPr>
                 <w:sz w:val="18"/>
               </w:rPr>
-              <w:t>transform_csv.py</w:t>
+              <w:t>extract_web.py</w:t>
             </w:r>
           </w:p>
         </w:tc>
@@ -2604,7 +2769,7 @@
               <w:rPr>
                 <w:sz w:val="18"/>
               </w:rPr>
-              <w:t>nombres en snake_case, fechas, ISO3, ubicaciones canónicas, duplicados y valores inválidos</w:t>
+              <w:t>descarga la página con requests, localiza la tabla con BeautifulSoup y la deja en staging</w:t>
             </w:r>
           </w:p>
         </w:tc>
@@ -2627,7 +2792,7 @@
               <w:rPr>
                 <w:sz w:val="18"/>
               </w:rPr>
-              <w:t>Transform OWID</w:t>
+              <w:t>Transform CSV</w:t>
             </w:r>
           </w:p>
         </w:tc>
@@ -2648,7 +2813,7 @@
               <w:rPr>
                 <w:sz w:val="18"/>
               </w:rPr>
-              <w:t>transform_owid.py</w:t>
+              <w:t>transform_csv.py</w:t>
             </w:r>
           </w:p>
         </w:tc>
@@ -2669,7 +2834,7 @@
               <w:rPr>
                 <w:sz w:val="18"/>
               </w:rPr>
-              <w:t>un valor vigente por país e indicador, sin agregados regionales</w:t>
+              <w:t>nombres en snake_case, fechas, ISO3, ubicaciones canónicas, duplicados y valores inválidos</w:t>
             </w:r>
           </w:p>
         </w:tc>
@@ -2692,7 +2857,7 @@
               <w:rPr>
                 <w:sz w:val="18"/>
               </w:rPr>
-              <w:t>Transform API</w:t>
+              <w:t>Transform OWID</w:t>
             </w:r>
           </w:p>
         </w:tc>
@@ -2713,7 +2878,7 @@
               <w:rPr>
                 <w:sz w:val="18"/>
               </w:rPr>
-              <w:t>transform_api.py</w:t>
+              <w:t>transform_owid.py</w:t>
             </w:r>
           </w:p>
         </w:tc>
@@ -2734,7 +2899,7 @@
               <w:rPr>
                 <w:sz w:val="18"/>
               </w:rPr>
-              <w:t>horas a promedio diario, categoría EPA desde el AQI, solo días completos</w:t>
+              <w:t>un valor vigente por país e indicador, sin agregados regionales</w:t>
             </w:r>
           </w:p>
         </w:tc>
@@ -2757,7 +2922,7 @@
               <w:rPr>
                 <w:sz w:val="18"/>
               </w:rPr>
-              <w:t>Merge</w:t>
+              <w:t>Transform API</w:t>
             </w:r>
           </w:p>
         </w:tc>
@@ -2778,7 +2943,7 @@
               <w:rPr>
                 <w:sz w:val="18"/>
               </w:rPr>
-              <w:t>merge.py</w:t>
+              <w:t>transform_api.py</w:t>
             </w:r>
           </w:p>
         </w:tc>
@@ -2799,7 +2964,7 @@
               <w:rPr>
                 <w:sz w:val="18"/>
               </w:rPr>
-              <w:t>dataset enriquecido con lecturas de CSV y API, indicadores del país y razón contra la guía de la OMS</w:t>
+              <w:t>horas a promedio diario, categoría EPA desde el AQI, solo días completos</w:t>
             </w:r>
           </w:p>
         </w:tc>
@@ -2822,7 +2987,7 @@
               <w:rPr>
                 <w:sz w:val="18"/>
               </w:rPr>
-              <w:t>Validación</w:t>
+              <w:t>Transform Web</w:t>
             </w:r>
           </w:p>
         </w:tc>
@@ -2843,7 +3008,7 @@
               <w:rPr>
                 <w:sz w:val="18"/>
               </w:rPr>
-              <w:t>quality.py</w:t>
+              <w:t>transform_web.py</w:t>
             </w:r>
           </w:p>
         </w:tc>
@@ -2864,7 +3029,7 @@
               <w:rPr>
                 <w:sz w:val="18"/>
               </w:rPr>
-              <w:t>tres suites de Great Expectations y registro de resultados</w:t>
+              <w:t>convierte a número, quita notas al pie y asigna ISO3 a cada país</w:t>
             </w:r>
           </w:p>
         </w:tc>
@@ -2887,7 +3052,7 @@
               <w:rPr>
                 <w:sz w:val="18"/>
               </w:rPr>
-              <w:t>Load</w:t>
+              <w:t>Merge</w:t>
             </w:r>
           </w:p>
         </w:tc>
@@ -2908,7 +3073,7 @@
               <w:rPr>
                 <w:sz w:val="18"/>
               </w:rPr>
-              <w:t>load_dw.py</w:t>
+              <w:t>merge.py</w:t>
             </w:r>
           </w:p>
         </w:tc>
@@ -2929,6 +3094,136 @@
               <w:rPr>
                 <w:sz w:val="18"/>
               </w:rPr>
+              <w:t>dataset enriquecido con lecturas de CSV y API, indicadores del país, PM2.5 nacional de la web y razón contra la guía de la OMS</w:t>
+            </w:r>
+          </w:p>
+        </w:tc>
+      </w:tr>
+      <w:tr>
+        <w:tc>
+          <w:tcPr>
+            <w:tcW w:type="dxa" w:w="2016"/>
+          </w:tcPr>
+          <w:p>
+            <w:pPr>
+              <w:spacing w:line="240" w:lineRule="auto" w:after="0"/>
+            </w:pPr>
+            <w:r>
+              <w:rPr>
+                <w:sz w:val="18"/>
+              </w:rPr>
+            </w:r>
+            <w:r>
+              <w:rPr>
+                <w:sz w:val="18"/>
+              </w:rPr>
+              <w:t>Validación</w:t>
+            </w:r>
+          </w:p>
+        </w:tc>
+        <w:tc>
+          <w:tcPr>
+            <w:tcW w:type="dxa" w:w="2160"/>
+          </w:tcPr>
+          <w:p>
+            <w:pPr>
+              <w:spacing w:line="240" w:lineRule="auto" w:after="0"/>
+            </w:pPr>
+            <w:r>
+              <w:rPr>
+                <w:sz w:val="18"/>
+              </w:rPr>
+            </w:r>
+            <w:r>
+              <w:rPr>
+                <w:sz w:val="18"/>
+              </w:rPr>
+              <w:t>quality.py</w:t>
+            </w:r>
+          </w:p>
+        </w:tc>
+        <w:tc>
+          <w:tcPr>
+            <w:tcW w:type="dxa" w:w="5184"/>
+          </w:tcPr>
+          <w:p>
+            <w:pPr>
+              <w:spacing w:line="240" w:lineRule="auto" w:after="0"/>
+            </w:pPr>
+            <w:r>
+              <w:rPr>
+                <w:sz w:val="18"/>
+              </w:rPr>
+            </w:r>
+            <w:r>
+              <w:rPr>
+                <w:sz w:val="18"/>
+              </w:rPr>
+              <w:t>cuatro suites de Great Expectations y registro de resultados</w:t>
+            </w:r>
+          </w:p>
+        </w:tc>
+      </w:tr>
+      <w:tr>
+        <w:tc>
+          <w:tcPr>
+            <w:tcW w:type="dxa" w:w="2016"/>
+          </w:tcPr>
+          <w:p>
+            <w:pPr>
+              <w:spacing w:line="240" w:lineRule="auto" w:after="0"/>
+            </w:pPr>
+            <w:r>
+              <w:rPr>
+                <w:sz w:val="18"/>
+              </w:rPr>
+            </w:r>
+            <w:r>
+              <w:rPr>
+                <w:sz w:val="18"/>
+              </w:rPr>
+              <w:t>Load</w:t>
+            </w:r>
+          </w:p>
+        </w:tc>
+        <w:tc>
+          <w:tcPr>
+            <w:tcW w:type="dxa" w:w="2160"/>
+          </w:tcPr>
+          <w:p>
+            <w:pPr>
+              <w:spacing w:line="240" w:lineRule="auto" w:after="0"/>
+            </w:pPr>
+            <w:r>
+              <w:rPr>
+                <w:sz w:val="18"/>
+              </w:rPr>
+            </w:r>
+            <w:r>
+              <w:rPr>
+                <w:sz w:val="18"/>
+              </w:rPr>
+              <w:t>load_dw.py</w:t>
+            </w:r>
+          </w:p>
+        </w:tc>
+        <w:tc>
+          <w:tcPr>
+            <w:tcW w:type="dxa" w:w="5184"/>
+          </w:tcPr>
+          <w:p>
+            <w:pPr>
+              <w:spacing w:line="240" w:lineRule="auto" w:after="0"/>
+            </w:pPr>
+            <w:r>
+              <w:rPr>
+                <w:sz w:val="18"/>
+              </w:rPr>
+            </w:r>
+            <w:r>
+              <w:rPr>
+                <w:sz w:val="18"/>
+              </w:rPr>
               <w:t>dimensiones y luego hechos, en una transacción con carga masiva (COPY)</w:t>
             </w:r>
           </w:p>
@@ -3006,6 +3301,22 @@
     </w:p>
     <w:p>
       <w:pPr>
+        <w:pStyle w:val="ListBullet"/>
+      </w:pPr>
+      <w:r>
+        <w:t>El PM2.5 de la web es un promedio anual por país, no una lectura diaria; se usa como atributo del país y para calcular la diferencia con cada lectura de la ciudad, sin sustituir la medición.</w:t>
+      </w:r>
+    </w:p>
+    <w:p>
+      <w:pPr>
+        <w:pStyle w:val="ListBullet"/>
+      </w:pPr>
+      <w:r>
+        <w:t>Un país sin fila en la web queda con esos campos y con la diferencia contra el promedio nacional nulos.</w:t>
+      </w:r>
+    </w:p>
+    <w:p>
+      <w:pPr>
         <w:keepNext/>
         <w:jc w:val="center"/>
       </w:pPr>
@@ -3021,7 +3332,7 @@
         <w:ind w:firstLine="720"/>
       </w:pPr>
       <w:r>
-        <w:t>El DAG etl_calidad_aire se programa de forma diaria, con una sola ejecución activa a la vez (Apache Software Foundation, 2026). Sus tareas se organizan así: tres extracciones independientes que corren en paralelo (extract_csv, extract_db y extract_api), cada una seguida de su transformación; la tarea merge_sources, que espera las tres transformaciones; validate_quality, que ejecuta Great Expectations; y load_dw, que carga el Data Warehouse y registra la ejecución.</w:t>
+        <w:t>El DAG etl_calidad_aire se programa de forma diaria, con una sola ejecución activa a la vez (Apache Software Foundation, 2026). Sus tareas se organizan así: cuatro extracciones independientes que corren en paralelo (extract_csv, extract_db, extract_api y extract_web), cada una seguida de su transformación; la tarea merge_sources, que espera las cuatro transformaciones; validate_quality, que ejecuta Great Expectations; y load_dw, que carga el Data Warehouse y registra la ejecución.</w:t>
       </w:r>
     </w:p>
     <w:p>
@@ -3029,7 +3340,7 @@
         <w:ind w:firstLine="720"/>
       </w:pPr>
       <w:r>
-        <w:t>Si una expectativa crítica falla, validate_quality lanza una excepción sin reintentos y load_dw queda en estado upstream_failed, es decir, no se ejecuta. Cada tarea tiene dos reintentos con dos minutos de espera y una función de respaldo que registra cualquier fallo en la tabla de auditoría de ejecuciones. Para demostrar el bloqueo existe el parámetro prueba_falla_calidad, que inyecta filas inválidas en la unión. La Figura 4 muestra una ejecución bloqueada por ese motivo y la Figura 5 una ejecución exitosa.</w:t>
+        <w:t>Si una expectativa crítica falla, validate_quality lanza una excepción sin reintentos y load_dw queda en estado upstream_failed, es decir, no se ejecuta. Cada tarea tiene dos reintentos con dos minutos de espera, aunque un fallo que no es temporal, como un archivo dañado, agota los reintentos y requiere intervención, y una función de respaldo que registra cualquier fallo en la tabla de auditoría de ejecuciones. Para demostrar el bloqueo existe el parámetro prueba_falla_calidad, que inyecta filas inválidas en la unión. La Figura 4 muestra una ejecución bloqueada por ese motivo y la Figura 5 una ejecución exitosa.</w:t>
       </w:r>
     </w:p>
     <w:p>
@@ -3040,7 +3351,7 @@
       <w:r>
         <w:drawing>
           <wp:inline xmlns:a="http://schemas.openxmlformats.org/drawingml/2006/main" xmlns:pic="http://schemas.openxmlformats.org/drawingml/2006/picture">
-            <wp:extent cx="5486400" cy="3655314"/>
+            <wp:extent cx="5486400" cy="3147822"/>
             <wp:docPr id="4" name="Picture 4"/>
             <wp:cNvGraphicFramePr>
               <a:graphicFrameLocks noChangeAspect="1"/>
@@ -3061,7 +3372,7 @@
                   <pic:spPr>
                     <a:xfrm>
                       <a:off x="0" y="0"/>
-                      <a:ext cx="5486400" cy="3655314"/>
+                      <a:ext cx="5486400" cy="3147822"/>
                     </a:xfrm>
                     <a:prstGeom prst="rect"/>
                   </pic:spPr>
@@ -3092,7 +3403,7 @@
       <w:r>
         <w:drawing>
           <wp:inline xmlns:a="http://schemas.openxmlformats.org/drawingml/2006/main" xmlns:pic="http://schemas.openxmlformats.org/drawingml/2006/picture">
-            <wp:extent cx="5486400" cy="3655314"/>
+            <wp:extent cx="5486400" cy="3147822"/>
             <wp:docPr id="5" name="Picture 5"/>
             <wp:cNvGraphicFramePr>
               <a:graphicFrameLocks noChangeAspect="1"/>
@@ -3113,7 +3424,7 @@
                   <pic:spPr>
                     <a:xfrm>
                       <a:off x="0" y="0"/>
-                      <a:ext cx="5486400" cy="3655314"/>
+                      <a:ext cx="5486400" cy="3147822"/>
                     </a:xfrm>
                     <a:prstGeom prst="rect"/>
                   </pic:spPr>
@@ -3133,7 +3444,7 @@
       </w:r>
       <w:r>
         <w:br/>
-        <w:t>Ejecución exitosa del DAG con las nueve tareas completadas.</w:t>
+        <w:t>Ejecución exitosa del DAG con las once tareas completadas.</w:t>
       </w:r>
     </w:p>
     <w:p>
@@ -3153,7 +3464,7 @@
         <w:ind w:firstLine="720"/>
       </w:pPr>
       <w:r>
-        <w:t>La validación se implementó con tres suites (Great Expectations, 2026), definidas en código y versionadas como archivos JSON. Cada expectativa es crítica, si bloquea la carga, o de advertencia, si solo se registra. El resultado de cada expectativa se guarda en una tabla de auditoría y se generan los Data Docs de la biblioteca.</w:t>
+        <w:t>La validación se implementó con cuatro suites (Great Expectations, 2026), definidas en código y versionadas como archivos JSON. Cada expectativa es crítica, si bloquea la carga, o de advertencia, si solo se registra. El resultado de cada expectativa se guarda en una tabla de auditoría y se generan los Data Docs de la biblioteca.</w:t>
       </w:r>
     </w:p>
     <w:p>
@@ -3542,6 +3853,92 @@
           </w:p>
         </w:tc>
       </w:tr>
+      <w:tr>
+        <w:tc>
+          <w:tcPr>
+            <w:tcW w:type="dxa" w:w="2160"/>
+          </w:tcPr>
+          <w:p>
+            <w:pPr>
+              <w:spacing w:line="240" w:lineRule="auto" w:after="0"/>
+            </w:pPr>
+            <w:r>
+              <w:rPr>
+                <w:sz w:val="18"/>
+              </w:rPr>
+            </w:r>
+            <w:r>
+              <w:rPr>
+                <w:sz w:val="18"/>
+              </w:rPr>
+              <w:t>Tabla web de PM2.5</w:t>
+            </w:r>
+          </w:p>
+        </w:tc>
+        <w:tc>
+          <w:tcPr>
+            <w:tcW w:type="dxa" w:w="1008"/>
+          </w:tcPr>
+          <w:p>
+            <w:pPr>
+              <w:spacing w:line="240" w:lineRule="auto" w:after="0"/>
+            </w:pPr>
+            <w:r>
+              <w:rPr>
+                <w:sz w:val="18"/>
+              </w:rPr>
+            </w:r>
+            <w:r>
+              <w:rPr>
+                <w:sz w:val="18"/>
+              </w:rPr>
+              <w:t>5</w:t>
+            </w:r>
+          </w:p>
+        </w:tc>
+        <w:tc>
+          <w:tcPr>
+            <w:tcW w:type="dxa" w:w="1296"/>
+          </w:tcPr>
+          <w:p>
+            <w:pPr>
+              <w:spacing w:line="240" w:lineRule="auto" w:after="0"/>
+            </w:pPr>
+            <w:r>
+              <w:rPr>
+                <w:sz w:val="18"/>
+              </w:rPr>
+            </w:r>
+            <w:r>
+              <w:rPr>
+                <w:sz w:val="18"/>
+              </w:rPr>
+              <w:t>1</w:t>
+            </w:r>
+          </w:p>
+        </w:tc>
+        <w:tc>
+          <w:tcPr>
+            <w:tcW w:type="dxa" w:w="4896"/>
+          </w:tcPr>
+          <w:p>
+            <w:pPr>
+              <w:spacing w:line="240" w:lineRule="auto" w:after="0"/>
+            </w:pPr>
+            <w:r>
+              <w:rPr>
+                <w:sz w:val="18"/>
+              </w:rPr>
+            </w:r>
+            <w:r>
+              <w:rPr>
+                <w:sz w:val="18"/>
+              </w:rPr>
+              <w:t>entre 150 y 260 países; ISO3 no nulo, único y con formato de tres letras; PM2.5 anual de 0 a 100; años de vida perdidos de 0 a 10</w:t>
+            </w:r>
+          </w:p>
+        </w:tc>
+      </w:tr>
     </w:tbl>
     <w:p/>
     <w:p>
@@ -3560,7 +3957,7 @@
       <w:r>
         <w:drawing>
           <wp:inline xmlns:a="http://schemas.openxmlformats.org/drawingml/2006/main" xmlns:pic="http://schemas.openxmlformats.org/drawingml/2006/picture">
-            <wp:extent cx="5486400" cy="3120390"/>
+            <wp:extent cx="5486400" cy="5191506"/>
             <wp:docPr id="6" name="Picture 6"/>
             <wp:cNvGraphicFramePr>
               <a:graphicFrameLocks noChangeAspect="1"/>
@@ -3581,7 +3978,7 @@
                   <pic:spPr>
                     <a:xfrm>
                       <a:off x="0" y="0"/>
-                      <a:ext cx="5486400" cy="3120390"/>
+                      <a:ext cx="5486400" cy="5191506"/>
                     </a:xfrm>
                     <a:prstGeom prst="rect"/>
                   </pic:spPr>
@@ -3621,7 +4018,7 @@
         <w:ind w:firstLine="720"/>
       </w:pPr>
       <w:r>
-        <w:t>El Data Warehouse sigue un esquema en estrella (Kimball y Ross, 2013), como muestra la Figura 7. La tabla de hechos contiene una fila por ciudad, día y fuente, con las variables de clima, los contaminantes, el índice EPA, la razón contra la guía de la OMS y una bandera de excedencia. Las dimensiones son ubicación, fecha, fuente e indicadores del país. Dos tablas de auditoría guardan los resultados de validación y el estado de cada ejecución.</w:t>
+        <w:t>El Data Warehouse sigue un esquema en estrella (Kimball y Ross, 2013), como muestra la Figura 7. La tabla de hechos contiene una fila por ciudad, día y fuente, con las variables de clima, los contaminantes, el índice EPA, la razón contra la guía de la OMS, una bandera de excedencia y la diferencia contra el promedio nacional. Las dimensiones son ubicación, fecha, fuente e indicadores del país, que incluye el PM2.5 anual y los años de vida perdidos de la web. Dos tablas de auditoría guardan los resultados de validación y el estado de cada ejecución.</w:t>
       </w:r>
     </w:p>
     <w:p>
@@ -3632,7 +4029,7 @@
       <w:r>
         <w:drawing>
           <wp:inline xmlns:a="http://schemas.openxmlformats.org/drawingml/2006/main" xmlns:pic="http://schemas.openxmlformats.org/drawingml/2006/picture">
-            <wp:extent cx="5669280" cy="4437615"/>
+            <wp:extent cx="5669280" cy="4281754"/>
             <wp:docPr id="7" name="Picture 7"/>
             <wp:cNvGraphicFramePr>
               <a:graphicFrameLocks noChangeAspect="1"/>
@@ -3653,7 +4050,7 @@
                   <pic:spPr>
                     <a:xfrm>
                       <a:off x="0" y="0"/>
-                      <a:ext cx="5669280" cy="4437615"/>
+                      <a:ext cx="5669280" cy="4281754"/>
                     </a:xfrm>
                     <a:prstGeom prst="rect"/>
                   </pic:spPr>
@@ -3693,7 +4090,7 @@
         <w:ind w:firstLine="720"/>
       </w:pPr>
       <w:r>
-        <w:t>El dashboard se construyó con Streamlit y consulta únicamente las tablas del Data Warehouse, es decir, datos ya validados. Con los datos cargados al 29 de septiembre de 2026 se obtienen los siguientes resultados:</w:t>
+        <w:t>El dashboard se construyó con Streamlit y consulta únicamente las tablas del Data Warehouse, es decir, datos ya validados. Con los datos cargados al 10 de octubre de 2026 (171,788 registros ciudad-día) se obtienen los siguientes resultados:</w:t>
       </w:r>
     </w:p>
     <w:p>
@@ -3701,7 +4098,7 @@
         <w:pStyle w:val="ListBullet"/>
       </w:pPr>
       <w:r>
-        <w:t>El 44 % de los registros ciudad-día superan la guía diaria de la OMS para PM2.5, y 82 de 233 ciudades (con al menos 30 días de datos) la superan en más de la mitad de los días. Santiago, Riad, Yakarta, Pekín y Nueva Delhi encabezan el ranking (Figura 8).</w:t>
+        <w:t>El 43.8 % de los registros ciudad-día superan la guía diaria de la OMS para PM2.5, y 88 de 260 ciudades la superan en más de la mitad de los días. Riad, Santiago, Yakarta, Pekín y Nueva Delhi encabezan el ranking (Figura 8).</w:t>
       </w:r>
     </w:p>
     <w:p>
@@ -3709,7 +4106,15 @@
         <w:pStyle w:val="ListBullet"/>
       </w:pPr>
       <w:r>
-        <w:t>La correlación de Spearman entre el PM2.5 y el CO₂ per cápita del país es -0.08 (187 países) y con el PIB per cápita es -0.21 (159 países): la contaminación de las capitales casi no se explica por las emisiones per cápita del país y solo se asocia débilmente con un menor ingreso (Figura 9).</w:t>
+        <w:t>La correlación de Spearman entre el PM2.5 y el CO₂ per cápita del país es -0.08 (187 países) y con el PIB per cápita es -0.22 (159 países): la contaminación de las capitales casi no se explica por las emisiones per cápita del país y solo se asocia débilmente con un menor ingreso (Figura 9).</w:t>
+      </w:r>
+    </w:p>
+    <w:p>
+      <w:pPr>
+        <w:pStyle w:val="ListBullet"/>
+      </w:pPr>
+      <w:r>
+        <w:t>Con la fuente web, 165 de 259 ciudades tienen un PM2.5 promedio mayor que el promedio anual de su país, lo que indica que las capitales concentran más contaminación que el promedio nacional (Figura 8).</w:t>
       </w:r>
     </w:p>
     <w:p>
@@ -3736,7 +4141,7 @@
       <w:r>
         <w:drawing>
           <wp:inline xmlns:a="http://schemas.openxmlformats.org/drawingml/2006/main" xmlns:pic="http://schemas.openxmlformats.org/drawingml/2006/picture">
-            <wp:extent cx="5120640" cy="3411626"/>
+            <wp:extent cx="5120640" cy="4800600"/>
             <wp:docPr id="8" name="Picture 8"/>
             <wp:cNvGraphicFramePr>
               <a:graphicFrameLocks noChangeAspect="1"/>
@@ -3757,7 +4162,7 @@
                   <pic:spPr>
                     <a:xfrm>
                       <a:off x="0" y="0"/>
-                      <a:ext cx="5120640" cy="3411626"/>
+                      <a:ext cx="5120640" cy="4800600"/>
                     </a:xfrm>
                     <a:prstGeom prst="rect"/>
                   </pic:spPr>
@@ -3777,7 +4182,7 @@
       </w:r>
       <w:r>
         <w:br/>
-        <w:t>Ranking de ciudades por PM2.5 promedio y mapa.</w:t>
+        <w:t>Ranking de ciudades, mapa y comparación de cada ciudad con el promedio nacional.</w:t>
       </w:r>
     </w:p>
     <w:p>
@@ -3788,7 +4193,7 @@
       <w:r>
         <w:drawing>
           <wp:inline xmlns:a="http://schemas.openxmlformats.org/drawingml/2006/main" xmlns:pic="http://schemas.openxmlformats.org/drawingml/2006/picture">
-            <wp:extent cx="5120640" cy="3411626"/>
+            <wp:extent cx="5120640" cy="4800600"/>
             <wp:docPr id="9" name="Picture 9"/>
             <wp:cNvGraphicFramePr>
               <a:graphicFrameLocks noChangeAspect="1"/>
@@ -3809,7 +4214,7 @@
                   <pic:spPr>
                     <a:xfrm>
                       <a:off x="0" y="0"/>
-                      <a:ext cx="5120640" cy="3411626"/>
+                      <a:ext cx="5120640" cy="4800600"/>
                     </a:xfrm>
                     <a:prstGeom prst="rect"/>
                   </pic:spPr>
@@ -3840,7 +4245,7 @@
       <w:r>
         <w:drawing>
           <wp:inline xmlns:a="http://schemas.openxmlformats.org/drawingml/2006/main" xmlns:pic="http://schemas.openxmlformats.org/drawingml/2006/picture">
-            <wp:extent cx="5120640" cy="3411626"/>
+            <wp:extent cx="5120640" cy="4800600"/>
             <wp:docPr id="10" name="Picture 10"/>
             <wp:cNvGraphicFramePr>
               <a:graphicFrameLocks noChangeAspect="1"/>
@@ -3861,7 +4266,7 @@
                   <pic:spPr>
                     <a:xfrm>
                       <a:off x="0" y="0"/>
-                      <a:ext cx="5120640" cy="3411626"/>
+                      <a:ext cx="5120640" cy="4800600"/>
                     </a:xfrm>
                     <a:prstGeom prst="rect"/>
                   </pic:spPr>
@@ -3892,7 +4297,7 @@
       <w:r>
         <w:drawing>
           <wp:inline xmlns:a="http://schemas.openxmlformats.org/drawingml/2006/main" xmlns:pic="http://schemas.openxmlformats.org/drawingml/2006/picture">
-            <wp:extent cx="5120640" cy="3411626"/>
+            <wp:extent cx="5120640" cy="4800600"/>
             <wp:docPr id="11" name="Picture 11"/>
             <wp:cNvGraphicFramePr>
               <a:graphicFrameLocks noChangeAspect="1"/>
@@ -3913,7 +4318,7 @@
                   <pic:spPr>
                     <a:xfrm>
                       <a:off x="0" y="0"/>
-                      <a:ext cx="5120640" cy="3411626"/>
+                      <a:ext cx="5120640" cy="4800600"/>
                     </a:xfrm>
                     <a:prstGeom prst="rect"/>
                   </pic:spPr>
@@ -4001,7 +4406,7 @@
         <w:ind w:firstLine="720"/>
       </w:pPr>
       <w:r>
-        <w:t>El pipeline automatiza la ingesta periódica de tres fuentes heterogéneas y las integra en un único dataset enriquecido. La validación con Great Expectations dentro del DAG impide que datos inválidos lleguen al Data Warehouse, como se comprobó inyectando datos corruptos, y el análisis exploratorio permitió detectar problemas reales de las fuentes, como nombres de país en otros idiomas, coordenadas cambiantes y lecturas físicamente imposibles. Los resultados muestran que casi la mitad de los registros ciudad-día superan la guía de la OMS para PM2.5 y que esa contaminación se relaciona poco con las emisiones per cápita del país. Como trabajo futuro se propone incorporar más contaminantes a los indicadores del dashboard y una carga incremental de los hechos históricos.</w:t>
+        <w:t>El pipeline automatiza la ingesta periódica de cuatro fuentes heterogéneas y las integra en un único dataset enriquecido. La validación con Great Expectations dentro del DAG impide que datos inválidos lleguen al Data Warehouse, como se comprobó inyectando datos corruptos, y el análisis exploratorio permitió detectar problemas reales de las fuentes, como nombres de país en otros idiomas, coordenadas cambiantes y lecturas físicamente imposibles. Los resultados muestran que casi la mitad de los registros ciudad-día superan la guía de la OMS para PM2.5 y que esa contaminación se relaciona poco con las emisiones per cápita del país. Como trabajo futuro se propone incorporar más contaminantes a los indicadores del dashboard y una carga incremental de los hechos históricos.</w:t>
       </w:r>
     </w:p>
     <w:p>
@@ -4063,6 +4468,14 @@
       </w:pPr>
       <w:r>
         <w:t>Ritchie, H., Rosado, P., &amp; Roser, M. (2023). CO₂ and greenhouse gas emissions. Our World in Data. https://ourworldindata.org/co2-and-greenhouse-gas-emissions</w:t>
+      </w:r>
+    </w:p>
+    <w:p>
+      <w:pPr>
+        <w:ind w:left="720" w:hanging="720"/>
+      </w:pPr>
+      <w:r>
+        <w:t>Wikipedia. (2026). List of countries by air pollution. https://en.wikipedia.org/wiki/List_of_countries_by_air_pollution</w:t>
       </w:r>
     </w:p>
     <w:p>

</xml_diff>

<commit_message>
docs: documento tecnico con la ruta de cuarentena
</commit_message>
<xml_diff>
--- a/docs/Documento_Tecnico_ETL_Airflow.docx
+++ b/docs/Documento_Tecnico_ETL_Airflow.docx
@@ -371,7 +371,7 @@
     </w:p>
     <w:p>
       <w:r>
-        <w:t>Este documento describe un pipeline ETL automatizado con Apache Airflow que integra cuatro fuentes de datos (un archivo CSV con lecturas históricas de clima y calidad del aire, una base de datos con indicadores de emisiones por país, la API pública Open-Meteo y una tabla web extraída mediante scraping), valida su calidad con Great Expectations y solo carga al Data Warehouse los datos que superan las validaciones. El almacén es una base PostgreSQL con modelo estrella y un dashboard en Streamlit consulta únicamente los datos ya validados. El proyecto está alineado con el Objetivo de Desarrollo Sostenible (ODS) 13, Acción por el clima, y con la meta 11.6 del ODS 11 sobre la calidad del aire urbano. Se presentan los objetivos refinados, el análisis exploratorio, el diseño del DAG, las reglas de calidad, el modelo de datos y las visualizaciones con sus conclusiones.</w:t>
+        <w:t>Este documento describe un pipeline ETL automatizado con Apache Airflow que integra cuatro fuentes de datos (un archivo CSV con lecturas históricas de clima y calidad del aire, una base de datos con indicadores de emisiones por país, la API pública Open-Meteo y una tabla web extraída mediante scraping), valida su calidad con Great Expectations, carga al Data Warehouse los lotes que superan las validaciones y envía a cuarentena los que no. El almacén es una base PostgreSQL con modelo estrella y un dashboard en Streamlit consulta únicamente los datos ya validados. El proyecto está alineado con el Objetivo de Desarrollo Sostenible (ODS) 13, Acción por el clima, y con la meta 11.6 del ODS 11 sobre la calidad del aire urbano. Se presentan los objetivos refinados, el análisis exploratorio, el diseño del DAG, las reglas de calidad, el modelo de datos y las visualizaciones con sus conclusiones.</w:t>
       </w:r>
     </w:p>
     <w:p>
@@ -443,7 +443,7 @@
         <w:pStyle w:val="ListBullet"/>
       </w:pPr>
       <w:r>
-        <w:t>Garantizar que solo se cargan datos válidos: cada ejecución se valida y, si falla una regla crítica, la carga se bloquea y queda registrada.</w:t>
+        <w:t>Garantizar que solo se cargan datos válidos: cada ejecución se valida y, si falla una regla crítica, el lote va a cuarentena, se emite una alerta y la carga no se ejecuta.</w:t>
       </w:r>
     </w:p>
     <w:p>
@@ -1019,7 +1019,7 @@
         <w:ind w:firstLine="720"/>
       </w:pPr>
       <w:r>
-        <w:t>La Figura 1 presenta la arquitectura actualizada. Las cuatro fuentes alimentan cuatro ramas paralelas dentro de un DAG de Airflow; las ramas se unen en un dataset enriquecido que pasa por la validación de Great Expectations y, solo si aprueba, se carga en el Data Warehouse. Los resultados de la validación y el estado de cada ejecución se guardan en tablas de auditoría. Todo se ejecuta con Docker Compose.</w:t>
+        <w:t>La Figura 1 presenta la arquitectura actualizada. Las cuatro fuentes alimentan cuatro ramas paralelas dentro de un DAG de Airflow; las ramas se unen en un dataset enriquecido que pasa por la validación de Great Expectations y, si aprueba, se carga en el Data Warehouse; si no aprueba, el lote se envía a cuarentena y se emite una alerta. Los resultados de la validación, los lotes en cuarentena y el estado de cada ejecución se guardan en tablas de auditoría. Todo se ejecuta con Docker Compose.</w:t>
       </w:r>
     </w:p>
     <w:p>
@@ -3159,7 +3159,7 @@
               <w:rPr>
                 <w:sz w:val="18"/>
               </w:rPr>
-              <w:t>cuatro suites de Great Expectations y registro de resultados</w:t>
+              <w:t>cuatro suites de Great Expectations, registro de resultados y decisión de la ruta del lote</w:t>
             </w:r>
           </w:p>
         </w:tc>
@@ -3182,7 +3182,7 @@
               <w:rPr>
                 <w:sz w:val="18"/>
               </w:rPr>
-              <w:t>Load</w:t>
+              <w:t>Cuarentena</w:t>
             </w:r>
           </w:p>
         </w:tc>
@@ -3203,7 +3203,7 @@
               <w:rPr>
                 <w:sz w:val="18"/>
               </w:rPr>
-              <w:t>load_dw.py</w:t>
+              <w:t>quarantine.py</w:t>
             </w:r>
           </w:p>
         </w:tc>
@@ -3224,6 +3224,71 @@
               <w:rPr>
                 <w:sz w:val="18"/>
               </w:rPr>
+              <w:t>si la validación falla: guarda las filas inválidas con su motivo, registra el lote y emite una alerta</w:t>
+            </w:r>
+          </w:p>
+        </w:tc>
+      </w:tr>
+      <w:tr>
+        <w:tc>
+          <w:tcPr>
+            <w:tcW w:type="dxa" w:w="2016"/>
+          </w:tcPr>
+          <w:p>
+            <w:pPr>
+              <w:spacing w:line="240" w:lineRule="auto" w:after="0"/>
+            </w:pPr>
+            <w:r>
+              <w:rPr>
+                <w:sz w:val="18"/>
+              </w:rPr>
+            </w:r>
+            <w:r>
+              <w:rPr>
+                <w:sz w:val="18"/>
+              </w:rPr>
+              <w:t>Load</w:t>
+            </w:r>
+          </w:p>
+        </w:tc>
+        <w:tc>
+          <w:tcPr>
+            <w:tcW w:type="dxa" w:w="2160"/>
+          </w:tcPr>
+          <w:p>
+            <w:pPr>
+              <w:spacing w:line="240" w:lineRule="auto" w:after="0"/>
+            </w:pPr>
+            <w:r>
+              <w:rPr>
+                <w:sz w:val="18"/>
+              </w:rPr>
+            </w:r>
+            <w:r>
+              <w:rPr>
+                <w:sz w:val="18"/>
+              </w:rPr>
+              <w:t>load_dw.py</w:t>
+            </w:r>
+          </w:p>
+        </w:tc>
+        <w:tc>
+          <w:tcPr>
+            <w:tcW w:type="dxa" w:w="5184"/>
+          </w:tcPr>
+          <w:p>
+            <w:pPr>
+              <w:spacing w:line="240" w:lineRule="auto" w:after="0"/>
+            </w:pPr>
+            <w:r>
+              <w:rPr>
+                <w:sz w:val="18"/>
+              </w:rPr>
+            </w:r>
+            <w:r>
+              <w:rPr>
+                <w:sz w:val="18"/>
+              </w:rPr>
               <w:t>dimensiones y luego hechos, en una transacción con carga masiva (COPY)</w:t>
             </w:r>
           </w:p>
@@ -3332,7 +3397,7 @@
         <w:ind w:firstLine="720"/>
       </w:pPr>
       <w:r>
-        <w:t>El DAG etl_calidad_aire se programa de forma diaria, con una sola ejecución activa a la vez (Apache Software Foundation, 2026). Sus tareas se organizan así: cuatro extracciones independientes que corren en paralelo (extract_csv, extract_db, extract_api y extract_web), cada una seguida de su transformación; la tarea merge_sources, que espera las cuatro transformaciones; validate_quality, que ejecuta Great Expectations; y load_dw, que carga el Data Warehouse y registra la ejecución.</w:t>
+        <w:t>El DAG etl_calidad_aire se programa de forma diaria, con una sola ejecución activa a la vez (Apache Software Foundation, 2026). Sus tareas se organizan así: cuatro extracciones independientes que corren en paralelo (extract_csv, extract_db, extract_api y extract_web), cada una seguida de su transformación; la tarea merge_sources, que espera las cuatro transformaciones; validate_quality, que ejecuta Great Expectations y decide la ruta del lote; load_dw, que carga el Data Warehouse y registra la ejecución cuando la calidad es buena; y quarantine_data, que se ejecuta cuando la calidad es mala.</w:t>
       </w:r>
     </w:p>
     <w:p>
@@ -3340,7 +3405,7 @@
         <w:ind w:firstLine="720"/>
       </w:pPr>
       <w:r>
-        <w:t>Si una expectativa crítica falla, validate_quality lanza una excepción sin reintentos y load_dw queda en estado upstream_failed, es decir, no se ejecuta. Cada tarea tiene dos reintentos con dos minutos de espera, aunque un fallo que no es temporal, como un archivo dañado, agota los reintentos y requiere intervención, y una función de respaldo que registra cualquier fallo en la tabla de auditoría de ejecuciones. Para demostrar el bloqueo existe el parámetro prueba_falla_calidad, que inyecta filas inválidas en la unión. La Figura 4 muestra una ejecución bloqueada por ese motivo y la Figura 5 una ejecución exitosa.</w:t>
+        <w:t>Si la calidad es buena, el flujo continúa hacia load_dw. Si una expectativa crítica falla, validate_quality enruta el flujo hacia quarantine_data y load_dw queda omitido (skipped): las filas inválidas se guardan con su motivo, el lote se registra en la tabla quarantine_log, la ejecución queda con estado quarantined y se emite una alerta, de modo que el Data Warehouse no cambia. Cada tarea tiene dos reintentos con dos minutos de espera, aunque un fallo que no es temporal, como un archivo dañado, agota los reintentos y requiere intervención, y una función de respaldo que registra cualquier fallo en la tabla de auditoría de ejecuciones. Para demostrar la cuarentena existe el parámetro prueba_falla_calidad, que inyecta filas inválidas en la unión. La Figura 4 muestra una ejecución enviada a cuarentena por ese motivo y la Figura 5 una ejecución exitosa.</w:t>
       </w:r>
     </w:p>
     <w:p>
@@ -3351,7 +3416,7 @@
       <w:r>
         <w:drawing>
           <wp:inline xmlns:a="http://schemas.openxmlformats.org/drawingml/2006/main" xmlns:pic="http://schemas.openxmlformats.org/drawingml/2006/picture">
-            <wp:extent cx="5486400" cy="3147822"/>
+            <wp:extent cx="5486400" cy="1915885"/>
             <wp:docPr id="4" name="Picture 4"/>
             <wp:cNvGraphicFramePr>
               <a:graphicFrameLocks noChangeAspect="1"/>
@@ -3372,7 +3437,7 @@
                   <pic:spPr>
                     <a:xfrm>
                       <a:off x="0" y="0"/>
-                      <a:ext cx="5486400" cy="3147822"/>
+                      <a:ext cx="5486400" cy="1915885"/>
                     </a:xfrm>
                     <a:prstGeom prst="rect"/>
                   </pic:spPr>
@@ -3392,7 +3457,7 @@
       </w:r>
       <w:r>
         <w:br/>
-        <w:t>Grafo del DAG en una ejecución con datos inválidos: la validación falla y la carga no se ejecuta.</w:t>
+        <w:t>Grafo del DAG en una ejecución con datos inválidos: el lote va a cuarentena y la carga se omite.</w:t>
       </w:r>
     </w:p>
     <w:p>
@@ -3403,7 +3468,7 @@
       <w:r>
         <w:drawing>
           <wp:inline xmlns:a="http://schemas.openxmlformats.org/drawingml/2006/main" xmlns:pic="http://schemas.openxmlformats.org/drawingml/2006/picture">
-            <wp:extent cx="5486400" cy="3147822"/>
+            <wp:extent cx="5486400" cy="1915885"/>
             <wp:docPr id="5" name="Picture 5"/>
             <wp:cNvGraphicFramePr>
               <a:graphicFrameLocks noChangeAspect="1"/>
@@ -3424,7 +3489,7 @@
                   <pic:spPr>
                     <a:xfrm>
                       <a:off x="0" y="0"/>
-                      <a:ext cx="5486400" cy="3147822"/>
+                      <a:ext cx="5486400" cy="1915885"/>
                     </a:xfrm>
                     <a:prstGeom prst="rect"/>
                   </pic:spPr>
@@ -3444,7 +3509,7 @@
       </w:r>
       <w:r>
         <w:br/>
-        <w:t>Ejecución exitosa del DAG con las once tareas completadas.</w:t>
+        <w:t>Ejecución exitosa del DAG: la carga se ejecuta y la cuarentena se omite.</w:t>
       </w:r>
     </w:p>
     <w:p>
@@ -3464,7 +3529,7 @@
         <w:ind w:firstLine="720"/>
       </w:pPr>
       <w:r>
-        <w:t>La validación se implementó con cuatro suites (Great Expectations, 2026), definidas en código y versionadas como archivos JSON. Cada expectativa es crítica, si bloquea la carga, o de advertencia, si solo se registra. El resultado de cada expectativa se guarda en una tabla de auditoría y se generan los Data Docs de la biblioteca.</w:t>
+        <w:t>La validación se implementó con cuatro suites (Great Expectations, 2026), definidas en código y versionadas como archivos JSON. Cada expectativa es crítica, si envía el lote a cuarentena y bloquea la carga, o de advertencia, si solo se registra. El resultado de cada expectativa se guarda en una tabla de auditoría y se generan los Data Docs de la biblioteca.</w:t>
       </w:r>
     </w:p>
     <w:p>
@@ -3946,7 +4011,7 @@
         <w:ind w:firstLine="720"/>
       </w:pPr>
       <w:r>
-        <w:t>La Figura 6 muestra la validación de una ejecución con datos inválidos: se cumplen 15 de 17 expectativas y fallan dos críticas (humedad fuera de rango y filas repetidas), lo que basta para bloquear la carga.</w:t>
+        <w:t>La Figura 6 muestra la validación de una ejecución con datos inválidos: se cumplen 15 de 17 expectativas y fallan dos críticas (humedad fuera de rango y filas repetidas), lo que basta para enviar el lote a cuarentena.</w:t>
       </w:r>
     </w:p>
     <w:p>
@@ -4018,7 +4083,7 @@
         <w:ind w:firstLine="720"/>
       </w:pPr>
       <w:r>
-        <w:t>El Data Warehouse sigue un esquema en estrella (Kimball y Ross, 2013), como muestra la Figura 7. La tabla de hechos contiene una fila por ciudad, día y fuente, con las variables de clima, los contaminantes, el índice EPA, la razón contra la guía de la OMS, una bandera de excedencia y la diferencia contra el promedio nacional. Las dimensiones son ubicación, fecha, fuente e indicadores del país, que incluye el PM2.5 anual y los años de vida perdidos de la web. Dos tablas de auditoría guardan los resultados de validación y el estado de cada ejecución.</w:t>
+        <w:t>El Data Warehouse sigue un esquema en estrella (Kimball y Ross, 2013), como muestra la Figura 7. La tabla de hechos contiene una fila por ciudad, día y fuente, con las variables de clima, los contaminantes, el índice EPA, la razón contra la guía de la OMS, una bandera de excedencia y la diferencia contra el promedio nacional. Las dimensiones son ubicación, fecha, fuente e indicadores del país, que incluye el PM2.5 anual y los años de vida perdidos de la web. Tres tablas de auditoría guardan los resultados de validación, los lotes enviados a cuarentena y el estado de cada ejecución.</w:t>
       </w:r>
     </w:p>
     <w:p>
@@ -4130,7 +4195,7 @@
         <w:pStyle w:val="ListBullet"/>
       </w:pPr>
       <w:r>
-        <w:t>La pestaña de calidad de los datos muestra el estado de la última ejecución, el resumen de la última validación y el historial, incluida la ejecución bloqueada de la demostración (Figura 11).</w:t>
+        <w:t>La pestaña de calidad de los datos muestra el estado de la última ejecución, el resumen de la última validación y el historial, incluida la ejecución enviada a cuarentena en la demostración (Figura 11).</w:t>
       </w:r>
     </w:p>
     <w:p>
@@ -4297,7 +4362,7 @@
       <w:r>
         <w:drawing>
           <wp:inline xmlns:a="http://schemas.openxmlformats.org/drawingml/2006/main" xmlns:pic="http://schemas.openxmlformats.org/drawingml/2006/picture">
-            <wp:extent cx="5120640" cy="4800600"/>
+            <wp:extent cx="5120640" cy="4459224"/>
             <wp:docPr id="11" name="Picture 11"/>
             <wp:cNvGraphicFramePr>
               <a:graphicFrameLocks noChangeAspect="1"/>
@@ -4318,7 +4383,7 @@
                   <pic:spPr>
                     <a:xfrm>
                       <a:off x="0" y="0"/>
-                      <a:ext cx="5120640" cy="4800600"/>
+                      <a:ext cx="5120640" cy="4459224"/>
                     </a:xfrm>
                     <a:prstGeom prst="rect"/>
                   </pic:spPr>
@@ -4406,7 +4471,7 @@
         <w:ind w:firstLine="720"/>
       </w:pPr>
       <w:r>
-        <w:t>El pipeline automatiza la ingesta periódica de cuatro fuentes heterogéneas y las integra en un único dataset enriquecido. La validación con Great Expectations dentro del DAG impide que datos inválidos lleguen al Data Warehouse, como se comprobó inyectando datos corruptos, y el análisis exploratorio permitió detectar problemas reales de las fuentes, como nombres de país en otros idiomas, coordenadas cambiantes y lecturas físicamente imposibles. Los resultados muestran que casi la mitad de los registros ciudad-día superan la guía de la OMS para PM2.5 y que esa contaminación se relaciona poco con las emisiones per cápita del país. Como trabajo futuro se propone incorporar más contaminantes a los indicadores del dashboard y una carga incremental de los hechos históricos.</w:t>
+        <w:t>El pipeline automatiza la ingesta periódica de cuatro fuentes heterogéneas y las integra en un único dataset enriquecido. La validación con Great Expectations dentro del DAG impide que datos inválidos lleguen al Data Warehouse y los envía a cuarentena con una alerta, como se comprobó inyectando datos corruptos, y el análisis exploratorio permitió detectar problemas reales de las fuentes, como nombres de país en otros idiomas, coordenadas cambiantes y lecturas físicamente imposibles. Los resultados muestran que casi la mitad de los registros ciudad-día superan la guía de la OMS para PM2.5 y que esa contaminación se relaciona poco con las emisiones per cápita del país. Como trabajo futuro se propone incorporar más contaminantes a los indicadores del dashboard y una carga incremental de los hechos históricos.</w:t>
       </w:r>
     </w:p>
     <w:p>

</xml_diff>

<commit_message>
docs: diagrama de arquitectura con la ruta de cuarentena
</commit_message>
<xml_diff>
--- a/docs/Documento_Tecnico_ETL_Airflow.docx
+++ b/docs/Documento_Tecnico_ETL_Airflow.docx
@@ -1030,7 +1030,7 @@
       <w:r>
         <w:drawing>
           <wp:inline xmlns:a="http://schemas.openxmlformats.org/drawingml/2006/main" xmlns:pic="http://schemas.openxmlformats.org/drawingml/2006/picture">
-            <wp:extent cx="5760720" cy="1829071"/>
+            <wp:extent cx="5760720" cy="1816137"/>
             <wp:docPr id="1" name="Picture 1"/>
             <wp:cNvGraphicFramePr>
               <a:graphicFrameLocks noChangeAspect="1"/>
@@ -1051,7 +1051,7 @@
                   <pic:spPr>
                     <a:xfrm>
                       <a:off x="0" y="0"/>
-                      <a:ext cx="5760720" cy="1829071"/>
+                      <a:ext cx="5760720" cy="1816137"/>
                     </a:xfrm>
                     <a:prstGeom prst="rect"/>
                   </pic:spPr>

</xml_diff>